<commit_message>
Finalize JSO submission package
Co-Authored-By: Codex <codex@openai.com>
</commit_message>
<xml_diff>
--- a/submission/jso/effective-without-warrant-jso-blind.docx
+++ b/submission/jso/effective-without-warrant-jso-blind.docx
@@ -2,9 +2,10 @@
 <file path=word/document.xml><?xml version="1.0" encoding="utf-8"?>
 <w:document xmlns:w="http://schemas.openxmlformats.org/wordprocessingml/2006/main" xmlns:m="http://schemas.openxmlformats.org/officeDocument/2006/math" xmlns:r="http://schemas.openxmlformats.org/officeDocument/2006/relationships" xmlns:o="urn:schemas-microsoft-com:office:office" xmlns:v="urn:schemas-microsoft-com:vml" xmlns:w10="urn:schemas-microsoft-com:office:word" xmlns:a="http://schemas.openxmlformats.org/drawingml/2006/main" xmlns:pic="http://schemas.openxmlformats.org/drawingml/2006/picture" xmlns:wp="http://schemas.openxmlformats.org/drawingml/2006/wordprocessingDrawing">
   <w:body>
-    <w:p>
-      <w:pPr>
-        <w:pStyle w:val="Title"/>
+    <w:bookmarkStart w:id="9" w:name="Xc0b0af723b8c38b004514af452365b4cbea1114"/>
+    <w:p>
+      <w:pPr>
+        <w:pStyle w:val="Heading1"/>
         <w:spacing w:line="240" w:lineRule="auto"/>
       </w:pPr>
       <w:r>
@@ -15,7 +16,8 @@
         <w:t xml:space="preserve">Effective without warrant: Causal-normative networks and the social life of status</w:t>
       </w:r>
     </w:p>
-    <w:bookmarkStart w:id="9" w:name="abstract"/>
+    <w:bookmarkEnd w:id="9"/>
+    <w:bookmarkStart w:id="10" w:name="abstract"/>
     <w:p>
       <w:pPr>
         <w:pStyle w:val="Heading1"/>
@@ -55,8 +57,8 @@
         <w:t xml:space="preserve">Keywords: social ontology, social status, social kinds, projectibility, causal-normative networks, recognition, misrecognition, conferralism, institutional facts, discrimination.</w:t>
       </w:r>
     </w:p>
-    <w:bookmarkEnd w:id="9"/>
-    <w:bookmarkStart w:id="11" w:name="sec:problem"/>
+    <w:bookmarkEnd w:id="10"/>
+    <w:bookmarkStart w:id="12" w:name="sec:problem"/>
     <w:p>
       <w:pPr>
         <w:pStyle w:val="Heading1"/>
@@ -111,7 +113,7 @@
           <w:rFonts w:ascii="Times New Roman" w:hAnsi="Times New Roman" w:cs="Times New Roman"/>
           <w:sz w:val="24"/>
         </w:rPr>
-        <w:footnoteReference w:id="10"/>
+        <w:footnoteReference w:id="11"/>
       </w:r>
       <w:r>
         <w:rPr>
@@ -472,8 +474,8 @@
         <w:t xml:space="preserve">’s frame principles and anchors explain why the field’s status conditions are in place; the network explains how those conditions combine with recognition and causal response.</w:t>
       </w:r>
     </w:p>
-    <w:bookmarkEnd w:id="11"/>
-    <w:bookmarkStart w:id="12" w:name="sec:causal-not-enough"/>
+    <w:bookmarkEnd w:id="12"/>
+    <w:bookmarkStart w:id="13" w:name="sec:causal-not-enough"/>
     <w:p>
       <w:pPr>
         <w:pStyle w:val="Heading1"/>
@@ -596,11 +598,32 @@
           <w:rFonts w:ascii="Times New Roman" w:hAnsi="Times New Roman" w:cs="Times New Roman"/>
           <w:sz w:val="24"/>
         </w:rPr>
-        <w:t xml:space="preserve">The extension to Khalidi is narrow. Projectibility still requires order. In moral and institutional cases, some of the order is carried by normative transitions and recognitional links rather than by causal mechanisms alone. Section 4 builds that typed network; the present point is only that ordinary causal networks are too narrow, not that order was the wrong demand.</w:t>
-      </w:r>
-    </w:p>
-    <w:bookmarkEnd w:id="12"/>
-    <w:bookmarkStart w:id="13" w:name="sec:normative-not-enough"/>
+        <w:t xml:space="preserve">The extension to Khalidi is narrow. Projectibility still requires order. Khalidi himself treats it as a live possibility that fundamental physics tracks structural real patterns while the special sciences track causal ones</w:t>
+      </w:r>
+      <w:r>
+        <w:rPr>
+          <w:rFonts w:ascii="Times New Roman" w:hAnsi="Times New Roman" w:cs="Times New Roman"/>
+          <w:sz w:val="24"/>
+        </w:rPr>
+        <w:t xml:space="preserve"> </w:t>
+      </w:r>
+      <w:r>
+        <w:rPr>
+          <w:rFonts w:ascii="Times New Roman" w:hAnsi="Times New Roman" w:cs="Times New Roman"/>
+          <w:sz w:val="24"/>
+        </w:rPr>
+        <w:t xml:space="preserve">(Khalidi 2013, 211–12)</w:t>
+      </w:r>
+      <w:r>
+        <w:rPr>
+          <w:rFonts w:ascii="Times New Roman" w:hAnsi="Times New Roman" w:cs="Times New Roman"/>
+          <w:sz w:val="24"/>
+        </w:rPr>
+        <w:t xml:space="preserve">. The moral and institutional cases make a parallel but more local point: some of their order is carried by normative transitions and recognitional links rather than by causal mechanisms alone. Section 4 builds that typed network; the present point is only that ordinary causal networks are too narrow, not that order was the wrong demand.</w:t>
+      </w:r>
+    </w:p>
+    <w:bookmarkEnd w:id="13"/>
+    <w:bookmarkStart w:id="14" w:name="sec:normative-not-enough"/>
     <w:p>
       <w:pPr>
         <w:pStyle w:val="Heading1"/>
@@ -764,8 +787,8 @@
         <w:t xml:space="preserve">The two reductions now fail from opposite sides. Causal order alone was too narrow; normative order alone is too thin. The explanatory unit is neither causal regularity nor normative status by itself, but a normative position coupled to causal uptake. Section 6 turns to the cases in which the two come apart.</w:t>
       </w:r>
     </w:p>
-    <w:bookmarkEnd w:id="13"/>
-    <w:bookmarkStart w:id="19" w:name="sec:typed-edge"/>
+    <w:bookmarkEnd w:id="14"/>
+    <w:bookmarkStart w:id="20" w:name="sec:typed-edge"/>
     <w:p>
       <w:pPr>
         <w:pStyle w:val="Heading1"/>
@@ -831,7 +854,7 @@
           <w:rFonts w:ascii="Times New Roman" w:hAnsi="Times New Roman" w:cs="Times New Roman"/>
           <w:sz w:val="24"/>
         </w:rPr>
-        <w:footnoteReference w:id="14"/>
+        <w:footnoteReference w:id="15"/>
       </w:r>
     </w:p>
     <w:p>
@@ -1379,18 +1402,18 @@
           <wp:inline>
             <wp:extent cx="5334000" cy="2764465"/>
             <wp:effectExtent b="0" l="0" r="0" t="0"/>
-            <wp:docPr descr="Figure 1. A promise as a causal-normative network. The undertaking generates the duty (a normative transition); the duty carries its correlative claim-right (a constitutive tie, drawn without an arrowhead, since correlatives are one relation under two descriptions, not a directed cause); the duty is tracked by recognition, which causally drives reliance, demand, and repair. The recognitional edge is drawn from the duty node for simplicity: recognition may track the duty–claim-right complex under either description. In failed cases the recognition node remains without a fitting edge (Section 4). The four edge types are keyed below the graph." title="" id="16" name="Picture"/>
+            <wp:docPr descr="Figure 1. A promise as a causal-normative network. The undertaking generates the duty (a normative transition); the duty carries its correlative claim-right (a constitutive tie, drawn without an arrowhead, since correlatives are one relation under two descriptions, not a directed cause); the duty is tracked by recognition, which causally drives reliance, demand, and repair. The recognitional edge is drawn from the duty node for simplicity: recognition may track the duty–claim-right complex under either description. In failed cases the recognition node remains without a fitting edge (Section 4). The four edge types are keyed below the graph." title="" id="17" name="Picture"/>
             <a:graphic>
               <a:graphicData uri="http://schemas.openxmlformats.org/drawingml/2006/picture">
                 <pic:pic>
                   <pic:nvPicPr>
-                    <pic:cNvPr descr="assets/fig-promise.png" id="17" name="Picture"/>
+                    <pic:cNvPr descr="assets/fig-promise.png" id="18" name="Picture"/>
                     <pic:cNvPicPr>
                       <a:picLocks noChangeArrowheads="1" noChangeAspect="1"/>
                     </pic:cNvPicPr>
                   </pic:nvPicPr>
                   <pic:blipFill>
-                    <a:blip r:embed="rId15"/>
+                    <a:blip r:embed="rId16"/>
                     <a:stretch>
                       <a:fillRect/>
                     </a:stretch>
@@ -1469,7 +1492,7 @@
         <w:t xml:space="preserve">Table 1 gives the compact ledger for the four carrying cases. It is not a list of case outcomes; it is a guide to what kind of inference each source item supports, and where that inference can fail.</w:t>
       </w:r>
     </w:p>
-    <w:bookmarkStart w:id="18" w:name="tab:projection-ledger"/>
+    <w:bookmarkStart w:id="19" w:name="tab:projection-ledger"/>
     <w:p>
       <w:pPr>
         <w:pStyle w:val="TableCaption"/>
@@ -1951,7 +1974,7 @@
         </w:tc>
       </w:tr>
     </w:tbl>
-    <w:bookmarkEnd w:id="18"/>
+    <w:bookmarkEnd w:id="19"/>
     <w:p>
       <w:pPr>
         <w:pStyle w:val="BodyText"/>
@@ -1978,8 +2001,8 @@
         <w:t xml:space="preserve">All these nodes and edges are field-indexed. Contract law, medical ethics, friendship, and discriminatory practices fix different repertoires, authorities, records, responses, and defeaters; Section 7 returns to the field parameter.</w:t>
       </w:r>
     </w:p>
-    <w:bookmarkEnd w:id="19"/>
-    <w:bookmarkStart w:id="20" w:name="sec:coupling"/>
+    <w:bookmarkEnd w:id="20"/>
+    <w:bookmarkStart w:id="21" w:name="sec:coupling"/>
     <w:p>
       <w:pPr>
         <w:pStyle w:val="Heading1"/>
@@ -2493,8 +2516,8 @@
         <w:t xml:space="preserve">The same point holds for discrimination. If a correspondence study changes the employer’s belief, it identifies a causal path from signal to recognition to callback. It does not settle whether the belief fits the applicant’s social status, or whether the status assignment has warrant. The interventionist disambiguation is useful, but it marks rather than removes the place where a normative edge is needed.</w:t>
       </w:r>
     </w:p>
-    <w:bookmarkEnd w:id="20"/>
-    <w:bookmarkStart w:id="25" w:name="sec:misrecognition"/>
+    <w:bookmarkEnd w:id="21"/>
+    <w:bookmarkStart w:id="26" w:name="sec:misrecognition"/>
     <w:p>
       <w:pPr>
         <w:pStyle w:val="Heading1"/>
@@ -2560,7 +2583,7 @@
         <w:t xml:space="preserve">Table 2 turns those questions into a checklist for status-assignments. Some columns are basic families of assessment; others are refinements needed for institutional, procedural, and recognitional cases. They often travel together in ordinary cases, but none carries the others with it.</w:t>
       </w:r>
     </w:p>
-    <w:bookmarkStart w:id="21" w:name="tab:assessment"/>
+    <w:bookmarkStart w:id="22" w:name="tab:assessment"/>
     <w:p>
       <w:pPr>
         <w:pStyle w:val="TableCaption"/>
@@ -2962,7 +2985,7 @@
         </w:tc>
       </w:tr>
     </w:tbl>
-    <w:bookmarkEnd w:id="21"/>
+    <w:bookmarkEnd w:id="22"/>
     <w:p>
       <w:pPr>
         <w:pStyle w:val="BodyText"/>
@@ -3278,18 +3301,18 @@
           <wp:inline>
             <wp:extent cx="5334000" cy="1473905"/>
             <wp:effectExtent b="0" l="0" r="0" t="0"/>
-            <wp:docPr descr="Figure 2. Wrongful conferral. A signal or ascription moves recognition, and recognition moves structurally empowered uptake and records. The orange edge marks status-conferral: agents with conferral standing can stabilize that uptake and confer an ascribed standing. The green dashed edge marks later recognition tracking the standing, not the conferral itself. Moral warrant, not the standing, is absent (grey annotation). This is not the false-promise case, where recognition fails to fit an absent status. Edge styles as in Figure 1." title="" id="23" name="Picture"/>
+            <wp:docPr descr="Figure 2. Wrongful conferral. A signal or ascription moves recognition, and recognition moves structurally empowered uptake and records. The orange edge marks status-conferral: agents with conferral standing can stabilize that uptake and confer an ascribed standing. The green dashed edge marks later recognition tracking the standing, not the conferral itself. Moral warrant, not the standing, is absent (grey annotation). This is not the false-promise case, where recognition fails to fit an absent status. Edge styles as in Figure 1." title="" id="24" name="Picture"/>
             <a:graphic>
               <a:graphicData uri="http://schemas.openxmlformats.org/drawingml/2006/picture">
                 <pic:pic>
                   <pic:nvPicPr>
-                    <pic:cNvPr descr="assets/fig-conferral.png" id="24" name="Picture"/>
+                    <pic:cNvPr descr="assets/fig-conferral.png" id="25" name="Picture"/>
                     <pic:cNvPicPr>
                       <a:picLocks noChangeArrowheads="1" noChangeAspect="1"/>
                     </pic:cNvPicPr>
                   </pic:nvPicPr>
                   <pic:blipFill>
-                    <a:blip r:embed="rId22"/>
+                    <a:blip r:embed="rId23"/>
                     <a:stretch>
                       <a:fillRect/>
                     </a:stretch>
@@ -3610,11 +3633,52 @@
           <w:rFonts w:ascii="Times New Roman" w:hAnsi="Times New Roman" w:cs="Times New Roman"/>
           <w:sz w:val="24"/>
         </w:rPr>
+        <w:t xml:space="preserve">That limit matters.</w:t>
+      </w:r>
+      <w:r>
+        <w:rPr>
+          <w:rFonts w:ascii="Times New Roman" w:hAnsi="Times New Roman" w:cs="Times New Roman"/>
+          <w:sz w:val="24"/>
+        </w:rPr>
+        <w:t xml:space="preserve"> </w:t>
+      </w:r>
+      <w:r>
+        <w:rPr>
+          <w:rFonts w:ascii="Times New Roman" w:hAnsi="Times New Roman" w:cs="Times New Roman"/>
+          <w:sz w:val="24"/>
+        </w:rPr>
+        <w:t xml:space="preserve">Marques (2017, 19–23)</w:t>
+      </w:r>
+      <w:r>
+        <w:rPr>
+          <w:rFonts w:ascii="Times New Roman" w:hAnsi="Times New Roman" w:cs="Times New Roman"/>
+          <w:sz w:val="24"/>
+        </w:rPr>
+        <w:t xml:space="preserve"> </w:t>
+      </w:r>
+      <w:r>
+        <w:rPr>
+          <w:rFonts w:ascii="Times New Roman" w:hAnsi="Times New Roman" w:cs="Times New Roman"/>
+          <w:sz w:val="24"/>
+        </w:rPr>
+        <w:t xml:space="preserve">argues that causal social construction remains politically relevant even where constitutive construction is granted or unsettled. The graph should keep ordinary causal routes to harm visible alongside the narrower conferral pattern.</w:t>
+      </w:r>
+    </w:p>
+    <w:p>
+      <w:pPr>
+        <w:pStyle w:val="BodyText"/>
+        <w:spacing w:line="240" w:lineRule="auto"/>
+      </w:pPr>
+      <w:r>
+        <w:rPr>
+          <w:rFonts w:ascii="Times New Roman" w:hAnsi="Times New Roman" w:cs="Times New Roman"/>
+          <w:sz w:val="24"/>
+        </w:rPr>
         <w:t xml:space="preserve">The route to wrongful conferral begins with the recognition pattern of Section 5. At the audit-study stage, one can vary a signal or recognition node and watch uptake move while the applicant and moral facts hold fixed. But wrongful conferral adds a further step. Once that recognition-response pathway is entrenched in a stable practice, the pathway helps generate a degraded standing rather than merely misrecognizing one. Only a coupled, typed structure registers both moments: the recognition is real and effective, and the standing stabilized by that pathway remains unwarranted.</w:t>
       </w:r>
     </w:p>
-    <w:bookmarkEnd w:id="25"/>
-    <w:bookmarkStart w:id="26" w:name="sec:fields"/>
+    <w:bookmarkEnd w:id="26"/>
+    <w:bookmarkStart w:id="27" w:name="sec:fields"/>
     <w:p>
       <w:pPr>
         <w:pStyle w:val="Heading1"/>
@@ -3838,6 +3902,33 @@
           <w:rFonts w:ascii="Times New Roman" w:hAnsi="Times New Roman" w:cs="Times New Roman"/>
           <w:sz w:val="24"/>
         </w:rPr>
+        <w:t xml:space="preserve">Almäng (2016, 6–8)</w:t>
+      </w:r>
+      <w:r>
+        <w:rPr>
+          <w:rFonts w:ascii="Times New Roman" w:hAnsi="Times New Roman" w:cs="Times New Roman"/>
+          <w:sz w:val="24"/>
+        </w:rPr>
+        <w:t xml:space="preserve"> </w:t>
+      </w:r>
+      <w:r>
+        <w:rPr>
+          <w:rFonts w:ascii="Times New Roman" w:hAnsi="Times New Roman" w:cs="Times New Roman"/>
+          <w:sz w:val="24"/>
+        </w:rPr>
+        <w:t xml:space="preserve">makes the legal version explicit: institutional status, deontic relation, and institutional function can come apart, so status and the exercise of its normally attached function should be represented separately.</w:t>
+      </w:r>
+    </w:p>
+    <w:p>
+      <w:pPr>
+        <w:pStyle w:val="BodyText"/>
+        <w:spacing w:line="240" w:lineRule="auto"/>
+      </w:pPr>
+      <w:r>
+        <w:rPr>
+          <w:rFonts w:ascii="Times New Roman" w:hAnsi="Times New Roman" w:cs="Times New Roman"/>
+          <w:sz w:val="24"/>
+        </w:rPr>
         <w:t xml:space="preserve">A limited analogy comes from assessment.</w:t>
       </w:r>
       <w:r>
@@ -4064,11 +4155,38 @@
           <w:rFonts w:ascii="Times New Roman" w:hAnsi="Times New Roman" w:cs="Times New Roman"/>
           <w:sz w:val="24"/>
         </w:rPr>
+        <w:t xml:space="preserve">Behrensen (2018, 42–43)</w:t>
+      </w:r>
+      <w:r>
+        <w:rPr>
+          <w:rFonts w:ascii="Times New Roman" w:hAnsi="Times New Roman" w:cs="Times New Roman"/>
+          <w:sz w:val="24"/>
+        </w:rPr>
+        <w:t xml:space="preserve"> </w:t>
+      </w:r>
+      <w:r>
+        <w:rPr>
+          <w:rFonts w:ascii="Times New Roman" w:hAnsi="Times New Roman" w:cs="Times New Roman"/>
+          <w:sz w:val="24"/>
+        </w:rPr>
+        <w:t xml:space="preserve">uses the same contrast for nationality: legal nationality is conferred through administrative acts, while social nationality is a multipolar process with no central authority. The example supports the field contrast without making nationality the template for every communal conferral.</w:t>
+      </w:r>
+    </w:p>
+    <w:p>
+      <w:pPr>
+        <w:pStyle w:val="BodyText"/>
+        <w:spacing w:line="240" w:lineRule="auto"/>
+      </w:pPr>
+      <w:r>
+        <w:rPr>
+          <w:rFonts w:ascii="Times New Roman" w:hAnsi="Times New Roman" w:cs="Times New Roman"/>
+          <w:sz w:val="24"/>
+        </w:rPr>
         <w:t xml:space="preserve">Ordinary promising and friendship are communal in this broad sense, though less regime-like than discriminatory standing. They lack a central office, but they still fix who can undertake, release, resent, apologize, repair, or defeat a claim well enough to support projection.</w:t>
       </w:r>
     </w:p>
-    <w:bookmarkEnd w:id="26"/>
-    <w:bookmarkStart w:id="27" w:name="sec:conclusion"/>
+    <w:bookmarkEnd w:id="27"/>
+    <w:bookmarkStart w:id="28" w:name="sec:conclusion"/>
     <w:p>
       <w:pPr>
         <w:pStyle w:val="Heading1"/>
@@ -4134,8 +4252,8 @@
         <w:t xml:space="preserve">The framework does more than remind us that some explanations contain both causal and normative material. Its stronger claim is that some projections are unavailable unless causal uptake, normative transition, recognition, and constitutive ties are represented together. That is why false recognition, wrongful institutional validity, wrongful communal conferral, and suppressed entitlement can be compared across fields. The model earns its keep by letting us compare without flattening and distinguish without isolating.</w:t>
       </w:r>
     </w:p>
-    <w:bookmarkEnd w:id="27"/>
-    <w:bookmarkStart w:id="73" w:name="bibliography"/>
+    <w:bookmarkEnd w:id="28"/>
+    <w:bookmarkStart w:id="82" w:name="bibliography"/>
     <w:p>
       <w:pPr>
         <w:pStyle w:val="Heading1"/>
@@ -4149,8 +4267,8 @@
         <w:t xml:space="preserve">References</w:t>
       </w:r>
     </w:p>
-    <w:bookmarkStart w:id="72" w:name="refs"/>
-    <w:bookmarkStart w:id="29" w:name="X5b22c5e287bd7709678a158e2683dc14d78bc59"/>
+    <w:bookmarkStart w:id="81" w:name="refs"/>
+    <w:bookmarkStart w:id="30" w:name="ref-almang2016LegalFacts"/>
     <w:p>
       <w:pPr>
         <w:pStyle w:val="Bibliography"/>
@@ -4161,7 +4279,21 @@
           <w:rFonts w:ascii="Times New Roman" w:hAnsi="Times New Roman" w:cs="Times New Roman"/>
           <w:sz w:val="24"/>
         </w:rPr>
-        <w:t xml:space="preserve">American Law Institute. 1981.</w:t>
+        <w:t xml:space="preserve">Almäng, Jan. 2016.</w:t>
+      </w:r>
+      <w:r>
+        <w:rPr>
+          <w:rFonts w:ascii="Times New Roman" w:hAnsi="Times New Roman" w:cs="Times New Roman"/>
+          <w:sz w:val="24"/>
+        </w:rPr>
+        <w:t xml:space="preserve"> </w:t>
+      </w:r>
+      <w:r>
+        <w:rPr>
+          <w:rFonts w:ascii="Times New Roman" w:hAnsi="Times New Roman" w:cs="Times New Roman"/>
+          <w:sz w:val="24"/>
+        </w:rPr>
+        <w:t xml:space="preserve">“Legal Facts and Dependence on Representations.”</w:t>
       </w:r>
       <w:r>
         <w:rPr>
@@ -4177,6 +4309,66 @@
           <w:iCs/>
           <w:sz w:val="24"/>
         </w:rPr>
+        <w:t xml:space="preserve">Journal of Social Ontology</w:t>
+      </w:r>
+      <w:r>
+        <w:rPr>
+          <w:rFonts w:ascii="Times New Roman" w:hAnsi="Times New Roman" w:cs="Times New Roman"/>
+          <w:sz w:val="24"/>
+        </w:rPr>
+        <w:t xml:space="preserve"> </w:t>
+      </w:r>
+      <w:r>
+        <w:rPr>
+          <w:rFonts w:ascii="Times New Roman" w:hAnsi="Times New Roman" w:cs="Times New Roman"/>
+          <w:sz w:val="24"/>
+        </w:rPr>
+        <w:t xml:space="preserve">2 (1): 1–15. doi:</w:t>
+      </w:r>
+      <w:hyperlink r:id="rId29">
+        <w:r>
+          <w:rPr>
+            <w:rStyle w:val="Hyperlink"/>
+          </w:rPr>
+          <w:t xml:space="preserve">10.1515/jso-2014-0027</w:t>
+        </w:r>
+      </w:hyperlink>
+      <w:r>
+        <w:rPr>
+          <w:rFonts w:ascii="Times New Roman" w:hAnsi="Times New Roman" w:cs="Times New Roman"/>
+          <w:sz w:val="24"/>
+        </w:rPr>
+        <w:t xml:space="preserve">.</w:t>
+      </w:r>
+    </w:p>
+    <w:bookmarkEnd w:id="30"/>
+    <w:bookmarkStart w:id="32" w:name="X5b22c5e287bd7709678a158e2683dc14d78bc59"/>
+    <w:p>
+      <w:pPr>
+        <w:pStyle w:val="Bibliography"/>
+        <w:spacing w:line="240" w:lineRule="auto"/>
+      </w:pPr>
+      <w:r>
+        <w:rPr>
+          <w:rFonts w:ascii="Times New Roman" w:hAnsi="Times New Roman" w:cs="Times New Roman"/>
+          <w:sz w:val="24"/>
+        </w:rPr>
+        <w:t xml:space="preserve">American Law Institute. 1981.</w:t>
+      </w:r>
+      <w:r>
+        <w:rPr>
+          <w:rFonts w:ascii="Times New Roman" w:hAnsi="Times New Roman" w:cs="Times New Roman"/>
+          <w:sz w:val="24"/>
+        </w:rPr>
+        <w:t xml:space="preserve"> </w:t>
+      </w:r>
+      <w:r>
+        <w:rPr>
+          <w:rFonts w:ascii="Times New Roman" w:hAnsi="Times New Roman" w:cs="Times New Roman"/>
+          <w:i/>
+          <w:iCs/>
+          <w:sz w:val="24"/>
+        </w:rPr>
         <w:t xml:space="preserve">Restatement of the Law Second, Contracts</w:t>
       </w:r>
       <w:r>
@@ -4193,7 +4385,7 @@
         </w:rPr>
         <w:t xml:space="preserve"> </w:t>
       </w:r>
-      <w:hyperlink r:id="rId28">
+      <w:hyperlink r:id="rId31">
         <w:r>
           <w:rPr>
             <w:rStyle w:val="Hyperlink"/>
@@ -4209,8 +4401,8 @@
         <w:t xml:space="preserve">.</w:t>
       </w:r>
     </w:p>
-    <w:bookmarkEnd w:id="29"/>
-    <w:bookmarkStart w:id="31" w:name="X7116318013013ec4c5e2b81a591d99cc6cfdbd6"/>
+    <w:bookmarkEnd w:id="32"/>
+    <w:bookmarkStart w:id="34" w:name="X7116318013013ec4c5e2b81a591d99cc6cfdbd6"/>
     <w:p>
       <w:pPr>
         <w:pStyle w:val="Bibliography"/>
@@ -4253,7 +4445,7 @@
         </w:rPr>
         <w:t xml:space="preserve"> </w:t>
       </w:r>
-      <w:hyperlink r:id="rId30">
+      <w:hyperlink r:id="rId33">
         <w:r>
           <w:rPr>
             <w:rStyle w:val="Hyperlink"/>
@@ -4269,8 +4461,8 @@
         <w:t xml:space="preserve">.</w:t>
       </w:r>
     </w:p>
-    <w:bookmarkEnd w:id="31"/>
-    <w:bookmarkStart w:id="33" w:name="ref-asta2018Categories"/>
+    <w:bookmarkEnd w:id="34"/>
+    <w:bookmarkStart w:id="36" w:name="ref-asta2018Categories"/>
     <w:p>
       <w:pPr>
         <w:pStyle w:val="Bibliography"/>
@@ -4306,7 +4498,7 @@
         </w:rPr>
         <w:t xml:space="preserve">. New York: Oxford University Press. doi:</w:t>
       </w:r>
-      <w:hyperlink r:id="rId32">
+      <w:hyperlink r:id="rId35">
         <w:r>
           <w:rPr>
             <w:rStyle w:val="Hyperlink"/>
@@ -4322,8 +4514,8 @@
         <w:t xml:space="preserve">.</w:t>
       </w:r>
     </w:p>
-    <w:bookmarkEnd w:id="33"/>
-    <w:bookmarkStart w:id="35" w:name="ref-ayres1991FairDriving"/>
+    <w:bookmarkEnd w:id="36"/>
+    <w:bookmarkStart w:id="38" w:name="ref-ayres1991FairDriving"/>
     <w:p>
       <w:pPr>
         <w:pStyle w:val="Bibliography"/>
@@ -4380,7 +4572,7 @@
         </w:rPr>
         <w:t xml:space="preserve">104 (4): 817–72. doi:</w:t>
       </w:r>
-      <w:hyperlink r:id="rId34">
+      <w:hyperlink r:id="rId37">
         <w:r>
           <w:rPr>
             <w:rStyle w:val="Hyperlink"/>
@@ -4396,8 +4588,8 @@
         <w:t xml:space="preserve">.</w:t>
       </w:r>
     </w:p>
-    <w:bookmarkEnd w:id="35"/>
-    <w:bookmarkStart w:id="37" w:name="ref-bertrandMullainathan2004EmilyGreg"/>
+    <w:bookmarkEnd w:id="38"/>
+    <w:bookmarkStart w:id="40" w:name="ref-behrensen2018MakingUpPeoples"/>
     <w:p>
       <w:pPr>
         <w:pStyle w:val="Bibliography"/>
@@ -4408,126 +4600,21 @@
           <w:rFonts w:ascii="Times New Roman" w:hAnsi="Times New Roman" w:cs="Times New Roman"/>
           <w:sz w:val="24"/>
         </w:rPr>
-        <w:t xml:space="preserve">Bertrand, Marianne, and Sendhil Mullainathan. 2004.</w:t>
-      </w:r>
-      <w:r>
-        <w:rPr>
-          <w:rFonts w:ascii="Times New Roman" w:hAnsi="Times New Roman" w:cs="Times New Roman"/>
-          <w:sz w:val="24"/>
-        </w:rPr>
-        <w:t xml:space="preserve"> </w:t>
-      </w:r>
-      <w:r>
-        <w:rPr>
-          <w:rFonts w:ascii="Times New Roman" w:hAnsi="Times New Roman" w:cs="Times New Roman"/>
-          <w:sz w:val="24"/>
-        </w:rPr>
-        <w:t xml:space="preserve">“Are</w:t>
-      </w:r>
-      <w:r>
-        <w:rPr>
-          <w:rFonts w:ascii="Times New Roman" w:hAnsi="Times New Roman" w:cs="Times New Roman"/>
-          <w:sz w:val="24"/>
-        </w:rPr>
-        <w:t xml:space="preserve"> </w:t>
-      </w:r>
-      <w:r>
-        <w:rPr>
-          <w:rFonts w:ascii="Times New Roman" w:hAnsi="Times New Roman" w:cs="Times New Roman"/>
-          <w:sz w:val="24"/>
-        </w:rPr>
-        <w:t xml:space="preserve">Emily</w:t>
-      </w:r>
-      <w:r>
-        <w:rPr>
-          <w:rFonts w:ascii="Times New Roman" w:hAnsi="Times New Roman" w:cs="Times New Roman"/>
-          <w:sz w:val="24"/>
-        </w:rPr>
-        <w:t xml:space="preserve"> </w:t>
-      </w:r>
-      <w:r>
-        <w:rPr>
-          <w:rFonts w:ascii="Times New Roman" w:hAnsi="Times New Roman" w:cs="Times New Roman"/>
-          <w:sz w:val="24"/>
-        </w:rPr>
-        <w:t xml:space="preserve">and</w:t>
-      </w:r>
-      <w:r>
-        <w:rPr>
-          <w:rFonts w:ascii="Times New Roman" w:hAnsi="Times New Roman" w:cs="Times New Roman"/>
-          <w:sz w:val="24"/>
-        </w:rPr>
-        <w:t xml:space="preserve"> </w:t>
-      </w:r>
-      <w:r>
-        <w:rPr>
-          <w:rFonts w:ascii="Times New Roman" w:hAnsi="Times New Roman" w:cs="Times New Roman"/>
-          <w:sz w:val="24"/>
-        </w:rPr>
-        <w:t xml:space="preserve">Greg</w:t>
-      </w:r>
-      <w:r>
-        <w:rPr>
-          <w:rFonts w:ascii="Times New Roman" w:hAnsi="Times New Roman" w:cs="Times New Roman"/>
-          <w:sz w:val="24"/>
-        </w:rPr>
-        <w:t xml:space="preserve"> </w:t>
-      </w:r>
-      <w:r>
-        <w:rPr>
-          <w:rFonts w:ascii="Times New Roman" w:hAnsi="Times New Roman" w:cs="Times New Roman"/>
-          <w:sz w:val="24"/>
-        </w:rPr>
-        <w:t xml:space="preserve">More Employable Than</w:t>
-      </w:r>
-      <w:r>
-        <w:rPr>
-          <w:rFonts w:ascii="Times New Roman" w:hAnsi="Times New Roman" w:cs="Times New Roman"/>
-          <w:sz w:val="24"/>
-        </w:rPr>
-        <w:t xml:space="preserve"> </w:t>
-      </w:r>
-      <w:r>
-        <w:rPr>
-          <w:rFonts w:ascii="Times New Roman" w:hAnsi="Times New Roman" w:cs="Times New Roman"/>
-          <w:sz w:val="24"/>
-        </w:rPr>
-        <w:t xml:space="preserve">Lakisha</w:t>
-      </w:r>
-      <w:r>
-        <w:rPr>
-          <w:rFonts w:ascii="Times New Roman" w:hAnsi="Times New Roman" w:cs="Times New Roman"/>
-          <w:sz w:val="24"/>
-        </w:rPr>
-        <w:t xml:space="preserve"> </w:t>
-      </w:r>
-      <w:r>
-        <w:rPr>
-          <w:rFonts w:ascii="Times New Roman" w:hAnsi="Times New Roman" w:cs="Times New Roman"/>
-          <w:sz w:val="24"/>
-        </w:rPr>
-        <w:t xml:space="preserve">and</w:t>
-      </w:r>
-      <w:r>
-        <w:rPr>
-          <w:rFonts w:ascii="Times New Roman" w:hAnsi="Times New Roman" w:cs="Times New Roman"/>
-          <w:sz w:val="24"/>
-        </w:rPr>
-        <w:t xml:space="preserve"> </w:t>
-      </w:r>
-      <w:r>
-        <w:rPr>
-          <w:rFonts w:ascii="Times New Roman" w:hAnsi="Times New Roman" w:cs="Times New Roman"/>
-          <w:sz w:val="24"/>
-        </w:rPr>
-        <w:t xml:space="preserve">Jamal</w:t>
-      </w:r>
-      <w:r>
-        <w:rPr>
-          <w:rFonts w:ascii="Times New Roman" w:hAnsi="Times New Roman" w:cs="Times New Roman"/>
-          <w:sz w:val="24"/>
-        </w:rPr>
-        <w:t xml:space="preserve">? A Field Experiment on Labor Market Discrimination.”</w:t>
+        <w:t xml:space="preserve">Behrensen, Maren. 2018.</w:t>
+      </w:r>
+      <w:r>
+        <w:rPr>
+          <w:rFonts w:ascii="Times New Roman" w:hAnsi="Times New Roman" w:cs="Times New Roman"/>
+          <w:sz w:val="24"/>
+        </w:rPr>
+        <w:t xml:space="preserve"> </w:t>
+      </w:r>
+      <w:r>
+        <w:rPr>
+          <w:rFonts w:ascii="Times New Roman" w:hAnsi="Times New Roman" w:cs="Times New Roman"/>
+          <w:sz w:val="24"/>
+        </w:rPr>
+        <w:t xml:space="preserve">“Making up Peoples? Conferralism about Nationality.”</w:t>
       </w:r>
       <w:r>
         <w:rPr>
@@ -4543,6 +4630,185 @@
           <w:iCs/>
           <w:sz w:val="24"/>
         </w:rPr>
+        <w:t xml:space="preserve">Journal of Social Ontology</w:t>
+      </w:r>
+      <w:r>
+        <w:rPr>
+          <w:rFonts w:ascii="Times New Roman" w:hAnsi="Times New Roman" w:cs="Times New Roman"/>
+          <w:sz w:val="24"/>
+        </w:rPr>
+        <w:t xml:space="preserve"> </w:t>
+      </w:r>
+      <w:r>
+        <w:rPr>
+          <w:rFonts w:ascii="Times New Roman" w:hAnsi="Times New Roman" w:cs="Times New Roman"/>
+          <w:sz w:val="24"/>
+        </w:rPr>
+        <w:t xml:space="preserve">4 (1): 29–51. doi:</w:t>
+      </w:r>
+      <w:hyperlink r:id="rId39">
+        <w:r>
+          <w:rPr>
+            <w:rStyle w:val="Hyperlink"/>
+          </w:rPr>
+          <w:t xml:space="preserve">10.1515/jso-2017-0020</w:t>
+        </w:r>
+      </w:hyperlink>
+      <w:r>
+        <w:rPr>
+          <w:rFonts w:ascii="Times New Roman" w:hAnsi="Times New Roman" w:cs="Times New Roman"/>
+          <w:sz w:val="24"/>
+        </w:rPr>
+        <w:t xml:space="preserve">.</w:t>
+      </w:r>
+    </w:p>
+    <w:bookmarkEnd w:id="40"/>
+    <w:bookmarkStart w:id="42" w:name="ref-bertrandMullainathan2004EmilyGreg"/>
+    <w:p>
+      <w:pPr>
+        <w:pStyle w:val="Bibliography"/>
+        <w:spacing w:line="240" w:lineRule="auto"/>
+      </w:pPr>
+      <w:r>
+        <w:rPr>
+          <w:rFonts w:ascii="Times New Roman" w:hAnsi="Times New Roman" w:cs="Times New Roman"/>
+          <w:sz w:val="24"/>
+        </w:rPr>
+        <w:t xml:space="preserve">Bertrand, Marianne, and Sendhil Mullainathan. 2004.</w:t>
+      </w:r>
+      <w:r>
+        <w:rPr>
+          <w:rFonts w:ascii="Times New Roman" w:hAnsi="Times New Roman" w:cs="Times New Roman"/>
+          <w:sz w:val="24"/>
+        </w:rPr>
+        <w:t xml:space="preserve"> </w:t>
+      </w:r>
+      <w:r>
+        <w:rPr>
+          <w:rFonts w:ascii="Times New Roman" w:hAnsi="Times New Roman" w:cs="Times New Roman"/>
+          <w:sz w:val="24"/>
+        </w:rPr>
+        <w:t xml:space="preserve">“Are</w:t>
+      </w:r>
+      <w:r>
+        <w:rPr>
+          <w:rFonts w:ascii="Times New Roman" w:hAnsi="Times New Roman" w:cs="Times New Roman"/>
+          <w:sz w:val="24"/>
+        </w:rPr>
+        <w:t xml:space="preserve"> </w:t>
+      </w:r>
+      <w:r>
+        <w:rPr>
+          <w:rFonts w:ascii="Times New Roman" w:hAnsi="Times New Roman" w:cs="Times New Roman"/>
+          <w:sz w:val="24"/>
+        </w:rPr>
+        <w:t xml:space="preserve">Emily</w:t>
+      </w:r>
+      <w:r>
+        <w:rPr>
+          <w:rFonts w:ascii="Times New Roman" w:hAnsi="Times New Roman" w:cs="Times New Roman"/>
+          <w:sz w:val="24"/>
+        </w:rPr>
+        <w:t xml:space="preserve"> </w:t>
+      </w:r>
+      <w:r>
+        <w:rPr>
+          <w:rFonts w:ascii="Times New Roman" w:hAnsi="Times New Roman" w:cs="Times New Roman"/>
+          <w:sz w:val="24"/>
+        </w:rPr>
+        <w:t xml:space="preserve">and</w:t>
+      </w:r>
+      <w:r>
+        <w:rPr>
+          <w:rFonts w:ascii="Times New Roman" w:hAnsi="Times New Roman" w:cs="Times New Roman"/>
+          <w:sz w:val="24"/>
+        </w:rPr>
+        <w:t xml:space="preserve"> </w:t>
+      </w:r>
+      <w:r>
+        <w:rPr>
+          <w:rFonts w:ascii="Times New Roman" w:hAnsi="Times New Roman" w:cs="Times New Roman"/>
+          <w:sz w:val="24"/>
+        </w:rPr>
+        <w:t xml:space="preserve">Greg</w:t>
+      </w:r>
+      <w:r>
+        <w:rPr>
+          <w:rFonts w:ascii="Times New Roman" w:hAnsi="Times New Roman" w:cs="Times New Roman"/>
+          <w:sz w:val="24"/>
+        </w:rPr>
+        <w:t xml:space="preserve"> </w:t>
+      </w:r>
+      <w:r>
+        <w:rPr>
+          <w:rFonts w:ascii="Times New Roman" w:hAnsi="Times New Roman" w:cs="Times New Roman"/>
+          <w:sz w:val="24"/>
+        </w:rPr>
+        <w:t xml:space="preserve">More Employable Than</w:t>
+      </w:r>
+      <w:r>
+        <w:rPr>
+          <w:rFonts w:ascii="Times New Roman" w:hAnsi="Times New Roman" w:cs="Times New Roman"/>
+          <w:sz w:val="24"/>
+        </w:rPr>
+        <w:t xml:space="preserve"> </w:t>
+      </w:r>
+      <w:r>
+        <w:rPr>
+          <w:rFonts w:ascii="Times New Roman" w:hAnsi="Times New Roman" w:cs="Times New Roman"/>
+          <w:sz w:val="24"/>
+        </w:rPr>
+        <w:t xml:space="preserve">Lakisha</w:t>
+      </w:r>
+      <w:r>
+        <w:rPr>
+          <w:rFonts w:ascii="Times New Roman" w:hAnsi="Times New Roman" w:cs="Times New Roman"/>
+          <w:sz w:val="24"/>
+        </w:rPr>
+        <w:t xml:space="preserve"> </w:t>
+      </w:r>
+      <w:r>
+        <w:rPr>
+          <w:rFonts w:ascii="Times New Roman" w:hAnsi="Times New Roman" w:cs="Times New Roman"/>
+          <w:sz w:val="24"/>
+        </w:rPr>
+        <w:t xml:space="preserve">and</w:t>
+      </w:r>
+      <w:r>
+        <w:rPr>
+          <w:rFonts w:ascii="Times New Roman" w:hAnsi="Times New Roman" w:cs="Times New Roman"/>
+          <w:sz w:val="24"/>
+        </w:rPr>
+        <w:t xml:space="preserve"> </w:t>
+      </w:r>
+      <w:r>
+        <w:rPr>
+          <w:rFonts w:ascii="Times New Roman" w:hAnsi="Times New Roman" w:cs="Times New Roman"/>
+          <w:sz w:val="24"/>
+        </w:rPr>
+        <w:t xml:space="preserve">Jamal</w:t>
+      </w:r>
+      <w:r>
+        <w:rPr>
+          <w:rFonts w:ascii="Times New Roman" w:hAnsi="Times New Roman" w:cs="Times New Roman"/>
+          <w:sz w:val="24"/>
+        </w:rPr>
+        <w:t xml:space="preserve">? A Field Experiment on Labor Market Discrimination.”</w:t>
+      </w:r>
+      <w:r>
+        <w:rPr>
+          <w:rFonts w:ascii="Times New Roman" w:hAnsi="Times New Roman" w:cs="Times New Roman"/>
+          <w:sz w:val="24"/>
+        </w:rPr>
+        <w:t xml:space="preserve"> </w:t>
+      </w:r>
+      <w:r>
+        <w:rPr>
+          <w:rFonts w:ascii="Times New Roman" w:hAnsi="Times New Roman" w:cs="Times New Roman"/>
+          <w:i/>
+          <w:iCs/>
+          <w:sz w:val="24"/>
+        </w:rPr>
         <w:t xml:space="preserve">American Economic Review</w:t>
       </w:r>
       <w:r>
@@ -4559,7 +4825,7 @@
         </w:rPr>
         <w:t xml:space="preserve">94 (4): 991–1013. doi:</w:t>
       </w:r>
-      <w:hyperlink r:id="rId36">
+      <w:hyperlink r:id="rId41">
         <w:r>
           <w:rPr>
             <w:rStyle w:val="Hyperlink"/>
@@ -4575,8 +4841,8 @@
         <w:t xml:space="preserve">.</w:t>
       </w:r>
     </w:p>
-    <w:bookmarkEnd w:id="37"/>
-    <w:bookmarkStart w:id="39" w:name="ref-boyd1999"/>
+    <w:bookmarkEnd w:id="42"/>
+    <w:bookmarkStart w:id="44" w:name="ref-boyd1999"/>
     <w:p>
       <w:pPr>
         <w:pStyle w:val="Bibliography"/>
@@ -4667,7 +4933,7 @@
         </w:rPr>
         <w:t xml:space="preserve">, edited by Robert A. Wilson, 141–86. Cambridge, MA: MIT Press. doi:</w:t>
       </w:r>
-      <w:hyperlink r:id="rId38">
+      <w:hyperlink r:id="rId43">
         <w:r>
           <w:rPr>
             <w:rStyle w:val="Hyperlink"/>
@@ -4683,8 +4949,8 @@
         <w:t xml:space="preserve">.</w:t>
       </w:r>
     </w:p>
-    <w:bookmarkEnd w:id="39"/>
-    <w:bookmarkStart w:id="41" w:name="ref-dickens1837PickwickPapers"/>
+    <w:bookmarkEnd w:id="44"/>
+    <w:bookmarkStart w:id="46" w:name="ref-dickens1837PickwickPapers"/>
     <w:p>
       <w:pPr>
         <w:pStyle w:val="Bibliography"/>
@@ -4745,7 +5011,7 @@
         </w:rPr>
         <w:t xml:space="preserve"> </w:t>
       </w:r>
-      <w:hyperlink r:id="rId40">
+      <w:hyperlink r:id="rId45">
         <w:r>
           <w:rPr>
             <w:rStyle w:val="Hyperlink"/>
@@ -4761,8 +5027,8 @@
         <w:t xml:space="preserve">.</w:t>
       </w:r>
     </w:p>
-    <w:bookmarkEnd w:id="41"/>
-    <w:bookmarkStart w:id="43" w:name="ref-epstein2015AntTrap"/>
+    <w:bookmarkEnd w:id="46"/>
+    <w:bookmarkStart w:id="48" w:name="ref-epstein2015AntTrap"/>
     <w:p>
       <w:pPr>
         <w:pStyle w:val="Bibliography"/>
@@ -4798,7 +5064,7 @@
         </w:rPr>
         <w:t xml:space="preserve">. New York: Oxford University Press. doi:</w:t>
       </w:r>
-      <w:hyperlink r:id="rId42">
+      <w:hyperlink r:id="rId47">
         <w:r>
           <w:rPr>
             <w:rStyle w:val="Hyperlink"/>
@@ -4814,8 +5080,8 @@
         <w:t xml:space="preserve">.</w:t>
       </w:r>
     </w:p>
-    <w:bookmarkEnd w:id="43"/>
-    <w:bookmarkStart w:id="44" w:name="ref-fraserHonneth2003Redistribution"/>
+    <w:bookmarkEnd w:id="48"/>
+    <w:bookmarkStart w:id="49" w:name="ref-fraserHonneth2003Redistribution"/>
     <w:p>
       <w:pPr>
         <w:pStyle w:val="Bibliography"/>
@@ -4852,8 +5118,8 @@
         <w:t xml:space="preserve">. London: Verso.</w:t>
       </w:r>
     </w:p>
-    <w:bookmarkEnd w:id="44"/>
-    <w:bookmarkStart w:id="46" w:name="ref-hohfeld1913SomeFundamental"/>
+    <w:bookmarkEnd w:id="49"/>
+    <w:bookmarkStart w:id="51" w:name="ref-hohfeld1913SomeFundamental"/>
     <w:p>
       <w:pPr>
         <w:pStyle w:val="Bibliography"/>
@@ -4910,7 +5176,7 @@
         </w:rPr>
         <w:t xml:space="preserve">23 (1): 16–59. doi:</w:t>
       </w:r>
-      <w:hyperlink r:id="rId45">
+      <w:hyperlink r:id="rId50">
         <w:r>
           <w:rPr>
             <w:rStyle w:val="Hyperlink"/>
@@ -4926,8 +5192,8 @@
         <w:t xml:space="preserve">.</w:t>
       </w:r>
     </w:p>
-    <w:bookmarkEnd w:id="46"/>
-    <w:bookmarkStart w:id="48" w:name="Xe6b458172609d1bad9cc7e096e5e86b2a95959f"/>
+    <w:bookmarkEnd w:id="51"/>
+    <w:bookmarkStart w:id="53" w:name="Xe6b458172609d1bad9cc7e096e5e86b2a95959f"/>
     <w:p>
       <w:pPr>
         <w:pStyle w:val="Bibliography"/>
@@ -4984,7 +5250,7 @@
         </w:rPr>
         <w:t xml:space="preserve"> </w:t>
       </w:r>
-      <w:hyperlink r:id="rId47">
+      <w:hyperlink r:id="rId52">
         <w:r>
           <w:rPr>
             <w:rStyle w:val="Hyperlink"/>
@@ -5000,8 +5266,8 @@
         <w:t xml:space="preserve">.</w:t>
       </w:r>
     </w:p>
-    <w:bookmarkEnd w:id="48"/>
-    <w:bookmarkStart w:id="50" w:name="ref-khalidi2018nodes"/>
+    <w:bookmarkEnd w:id="53"/>
+    <w:bookmarkStart w:id="55" w:name="ref-khalidi2013"/>
     <w:p>
       <w:pPr>
         <w:pStyle w:val="Bibliography"/>
@@ -5012,21 +5278,7 @@
           <w:rFonts w:ascii="Times New Roman" w:hAnsi="Times New Roman" w:cs="Times New Roman"/>
           <w:sz w:val="24"/>
         </w:rPr>
-        <w:t xml:space="preserve">Khalidi, Muhammad Ali. 2018.</w:t>
-      </w:r>
-      <w:r>
-        <w:rPr>
-          <w:rFonts w:ascii="Times New Roman" w:hAnsi="Times New Roman" w:cs="Times New Roman"/>
-          <w:sz w:val="24"/>
-        </w:rPr>
-        <w:t xml:space="preserve"> </w:t>
-      </w:r>
-      <w:r>
-        <w:rPr>
-          <w:rFonts w:ascii="Times New Roman" w:hAnsi="Times New Roman" w:cs="Times New Roman"/>
-          <w:sz w:val="24"/>
-        </w:rPr>
-        <w:t xml:space="preserve">“Natural Kinds as Nodes in Causal Networks.”</w:t>
+        <w:t xml:space="preserve">Khalidi, Muhammad Ali. 2013.</w:t>
       </w:r>
       <w:r>
         <w:rPr>
@@ -5042,6 +5294,100 @@
           <w:iCs/>
           <w:sz w:val="24"/>
         </w:rPr>
+        <w:t xml:space="preserve">Natural Categories and Human Kinds:</w:t>
+      </w:r>
+      <w:r>
+        <w:rPr>
+          <w:rFonts w:ascii="Times New Roman" w:hAnsi="Times New Roman" w:cs="Times New Roman"/>
+          <w:i/>
+          <w:iCs/>
+          <w:sz w:val="24"/>
+        </w:rPr>
+        <w:t xml:space="preserve"> </w:t>
+      </w:r>
+      <w:r>
+        <w:rPr>
+          <w:rFonts w:ascii="Times New Roman" w:hAnsi="Times New Roman" w:cs="Times New Roman"/>
+          <w:i/>
+          <w:iCs/>
+          <w:sz w:val="24"/>
+        </w:rPr>
+        <w:t xml:space="preserve">C</w:t>
+      </w:r>
+      <w:r>
+        <w:rPr>
+          <w:rFonts w:ascii="Times New Roman" w:hAnsi="Times New Roman" w:cs="Times New Roman"/>
+          <w:i/>
+          <w:iCs/>
+          <w:sz w:val="24"/>
+        </w:rPr>
+        <w:t xml:space="preserve">lassification in the Natural and Social Sciences</w:t>
+      </w:r>
+      <w:r>
+        <w:rPr>
+          <w:rFonts w:ascii="Times New Roman" w:hAnsi="Times New Roman" w:cs="Times New Roman"/>
+          <w:sz w:val="24"/>
+        </w:rPr>
+        <w:t xml:space="preserve">. Cambridge: Cambridge University Press. doi:</w:t>
+      </w:r>
+      <w:hyperlink r:id="rId54">
+        <w:r>
+          <w:rPr>
+            <w:rStyle w:val="Hyperlink"/>
+          </w:rPr>
+          <w:t xml:space="preserve">10.1017/CBO9780511998553</w:t>
+        </w:r>
+      </w:hyperlink>
+      <w:r>
+        <w:rPr>
+          <w:rFonts w:ascii="Times New Roman" w:hAnsi="Times New Roman" w:cs="Times New Roman"/>
+          <w:sz w:val="24"/>
+        </w:rPr>
+        <w:t xml:space="preserve">.</w:t>
+      </w:r>
+    </w:p>
+    <w:bookmarkEnd w:id="55"/>
+    <w:bookmarkStart w:id="57" w:name="ref-khalidi2018nodes"/>
+    <w:p>
+      <w:pPr>
+        <w:pStyle w:val="Bibliography"/>
+        <w:spacing w:line="240" w:lineRule="auto"/>
+      </w:pPr>
+      <w:r>
+        <w:rPr>
+          <w:rFonts w:ascii="Times New Roman" w:hAnsi="Times New Roman" w:cs="Times New Roman"/>
+          <w:sz w:val="24"/>
+        </w:rPr>
+        <w:t xml:space="preserve">———. 2018.</w:t>
+      </w:r>
+      <w:r>
+        <w:rPr>
+          <w:rFonts w:ascii="Times New Roman" w:hAnsi="Times New Roman" w:cs="Times New Roman"/>
+          <w:sz w:val="24"/>
+        </w:rPr>
+        <w:t xml:space="preserve"> </w:t>
+      </w:r>
+      <w:r>
+        <w:rPr>
+          <w:rFonts w:ascii="Times New Roman" w:hAnsi="Times New Roman" w:cs="Times New Roman"/>
+          <w:sz w:val="24"/>
+        </w:rPr>
+        <w:t xml:space="preserve">“Natural Kinds as Nodes in Causal Networks.”</w:t>
+      </w:r>
+      <w:r>
+        <w:rPr>
+          <w:rFonts w:ascii="Times New Roman" w:hAnsi="Times New Roman" w:cs="Times New Roman"/>
+          <w:sz w:val="24"/>
+        </w:rPr>
+        <w:t xml:space="preserve"> </w:t>
+      </w:r>
+      <w:r>
+        <w:rPr>
+          <w:rFonts w:ascii="Times New Roman" w:hAnsi="Times New Roman" w:cs="Times New Roman"/>
+          <w:i/>
+          <w:iCs/>
+          <w:sz w:val="24"/>
+        </w:rPr>
         <w:t xml:space="preserve">Synthese</w:t>
       </w:r>
       <w:r>
@@ -5058,7 +5404,7 @@
         </w:rPr>
         <w:t xml:space="preserve">195 (4): 1379–96. doi:</w:t>
       </w:r>
-      <w:hyperlink r:id="rId49">
+      <w:hyperlink r:id="rId56">
         <w:r>
           <w:rPr>
             <w:rStyle w:val="Hyperlink"/>
@@ -5074,8 +5420,8 @@
         <w:t xml:space="preserve">.</w:t>
       </w:r>
     </w:p>
-    <w:bookmarkEnd w:id="50"/>
-    <w:bookmarkStart w:id="52" w:name="ref-kohlerHausmann2019EddieMurphy"/>
+    <w:bookmarkEnd w:id="57"/>
+    <w:bookmarkStart w:id="59" w:name="ref-kohlerHausmann2019EddieMurphy"/>
     <w:p>
       <w:pPr>
         <w:pStyle w:val="Bibliography"/>
@@ -5160,7 +5506,7 @@
         </w:rPr>
         <w:t xml:space="preserve"> </w:t>
       </w:r>
-      <w:hyperlink r:id="rId51">
+      <w:hyperlink r:id="rId58">
         <w:r>
           <w:rPr>
             <w:rStyle w:val="Hyperlink"/>
@@ -5176,8 +5522,8 @@
         <w:t xml:space="preserve">.</w:t>
       </w:r>
     </w:p>
-    <w:bookmarkEnd w:id="52"/>
-    <w:bookmarkStart w:id="54" w:name="ref-messick1995Validity"/>
+    <w:bookmarkEnd w:id="59"/>
+    <w:bookmarkStart w:id="61" w:name="ref-marques2017CausalSocialConstruction"/>
     <w:p>
       <w:pPr>
         <w:pStyle w:val="Bibliography"/>
@@ -5188,21 +5534,21 @@
           <w:rFonts w:ascii="Times New Roman" w:hAnsi="Times New Roman" w:cs="Times New Roman"/>
           <w:sz w:val="24"/>
         </w:rPr>
-        <w:t xml:space="preserve">Messick, Samuel. 1995.</w:t>
-      </w:r>
-      <w:r>
-        <w:rPr>
-          <w:rFonts w:ascii="Times New Roman" w:hAnsi="Times New Roman" w:cs="Times New Roman"/>
-          <w:sz w:val="24"/>
-        </w:rPr>
-        <w:t xml:space="preserve"> </w:t>
-      </w:r>
-      <w:r>
-        <w:rPr>
-          <w:rFonts w:ascii="Times New Roman" w:hAnsi="Times New Roman" w:cs="Times New Roman"/>
-          <w:sz w:val="24"/>
-        </w:rPr>
-        <w:t xml:space="preserve">“Validity of Psychological Assessment: Validation of Inferences from Persons’ Responses and Performances as Scientific Inquiry into Score Meaning.”</w:t>
+        <w:t xml:space="preserve">Marques, Teresa. 2017.</w:t>
+      </w:r>
+      <w:r>
+        <w:rPr>
+          <w:rFonts w:ascii="Times New Roman" w:hAnsi="Times New Roman" w:cs="Times New Roman"/>
+          <w:sz w:val="24"/>
+        </w:rPr>
+        <w:t xml:space="preserve"> </w:t>
+      </w:r>
+      <w:r>
+        <w:rPr>
+          <w:rFonts w:ascii="Times New Roman" w:hAnsi="Times New Roman" w:cs="Times New Roman"/>
+          <w:sz w:val="24"/>
+        </w:rPr>
+        <w:t xml:space="preserve">“The Relevance of Causal Social Construction.”</w:t>
       </w:r>
       <w:r>
         <w:rPr>
@@ -5218,6 +5564,80 @@
           <w:iCs/>
           <w:sz w:val="24"/>
         </w:rPr>
+        <w:t xml:space="preserve">Journal of Social Ontology</w:t>
+      </w:r>
+      <w:r>
+        <w:rPr>
+          <w:rFonts w:ascii="Times New Roman" w:hAnsi="Times New Roman" w:cs="Times New Roman"/>
+          <w:sz w:val="24"/>
+        </w:rPr>
+        <w:t xml:space="preserve"> </w:t>
+      </w:r>
+      <w:r>
+        <w:rPr>
+          <w:rFonts w:ascii="Times New Roman" w:hAnsi="Times New Roman" w:cs="Times New Roman"/>
+          <w:sz w:val="24"/>
+        </w:rPr>
+        <w:t xml:space="preserve">3 (1): 1–25. doi:</w:t>
+      </w:r>
+      <w:hyperlink r:id="rId60">
+        <w:r>
+          <w:rPr>
+            <w:rStyle w:val="Hyperlink"/>
+          </w:rPr>
+          <w:t xml:space="preserve">10.1515/jso-2016-0018</w:t>
+        </w:r>
+      </w:hyperlink>
+      <w:r>
+        <w:rPr>
+          <w:rFonts w:ascii="Times New Roman" w:hAnsi="Times New Roman" w:cs="Times New Roman"/>
+          <w:sz w:val="24"/>
+        </w:rPr>
+        <w:t xml:space="preserve">.</w:t>
+      </w:r>
+    </w:p>
+    <w:bookmarkEnd w:id="61"/>
+    <w:bookmarkStart w:id="63" w:name="ref-messick1995Validity"/>
+    <w:p>
+      <w:pPr>
+        <w:pStyle w:val="Bibliography"/>
+        <w:spacing w:line="240" w:lineRule="auto"/>
+      </w:pPr>
+      <w:r>
+        <w:rPr>
+          <w:rFonts w:ascii="Times New Roman" w:hAnsi="Times New Roman" w:cs="Times New Roman"/>
+          <w:sz w:val="24"/>
+        </w:rPr>
+        <w:t xml:space="preserve">Messick, Samuel. 1995.</w:t>
+      </w:r>
+      <w:r>
+        <w:rPr>
+          <w:rFonts w:ascii="Times New Roman" w:hAnsi="Times New Roman" w:cs="Times New Roman"/>
+          <w:sz w:val="24"/>
+        </w:rPr>
+        <w:t xml:space="preserve"> </w:t>
+      </w:r>
+      <w:r>
+        <w:rPr>
+          <w:rFonts w:ascii="Times New Roman" w:hAnsi="Times New Roman" w:cs="Times New Roman"/>
+          <w:sz w:val="24"/>
+        </w:rPr>
+        <w:t xml:space="preserve">“Validity of Psychological Assessment: Validation of Inferences from Persons’ Responses and Performances as Scientific Inquiry into Score Meaning.”</w:t>
+      </w:r>
+      <w:r>
+        <w:rPr>
+          <w:rFonts w:ascii="Times New Roman" w:hAnsi="Times New Roman" w:cs="Times New Roman"/>
+          <w:sz w:val="24"/>
+        </w:rPr>
+        <w:t xml:space="preserve"> </w:t>
+      </w:r>
+      <w:r>
+        <w:rPr>
+          <w:rFonts w:ascii="Times New Roman" w:hAnsi="Times New Roman" w:cs="Times New Roman"/>
+          <w:i/>
+          <w:iCs/>
+          <w:sz w:val="24"/>
+        </w:rPr>
         <w:t xml:space="preserve">American Psychologist</w:t>
       </w:r>
       <w:r>
@@ -5234,7 +5654,7 @@
         </w:rPr>
         <w:t xml:space="preserve">50 (9): 741–49. doi:</w:t>
       </w:r>
-      <w:hyperlink r:id="rId53">
+      <w:hyperlink r:id="rId62">
         <w:r>
           <w:rPr>
             <w:rStyle w:val="Hyperlink"/>
@@ -5250,8 +5670,8 @@
         <w:t xml:space="preserve">.</w:t>
       </w:r>
     </w:p>
-    <w:bookmarkEnd w:id="54"/>
-    <w:bookmarkStart w:id="56" w:name="ref-owens2012ShapingNormativeLandscape"/>
+    <w:bookmarkEnd w:id="63"/>
+    <w:bookmarkStart w:id="65" w:name="ref-owens2012ShapingNormativeLandscape"/>
     <w:p>
       <w:pPr>
         <w:pStyle w:val="Bibliography"/>
@@ -5287,7 +5707,7 @@
         </w:rPr>
         <w:t xml:space="preserve">. Oxford: Oxford University Press. doi:</w:t>
       </w:r>
-      <w:hyperlink r:id="rId55">
+      <w:hyperlink r:id="rId64">
         <w:r>
           <w:rPr>
             <w:rStyle w:val="Hyperlink"/>
@@ -5303,8 +5723,8 @@
         <w:t xml:space="preserve">.</w:t>
       </w:r>
     </w:p>
-    <w:bookmarkEnd w:id="56"/>
-    <w:bookmarkStart w:id="58" w:name="ref-pullumRogers2008Expressive"/>
+    <w:bookmarkEnd w:id="65"/>
+    <w:bookmarkStart w:id="67" w:name="ref-pullumRogers2008Expressive"/>
     <w:p>
       <w:pPr>
         <w:pStyle w:val="Bibliography"/>
@@ -5359,7 +5779,7 @@
         </w:rPr>
         <w:t xml:space="preserve"> </w:t>
       </w:r>
-      <w:hyperlink r:id="rId57">
+      <w:hyperlink r:id="rId66">
         <w:r>
           <w:rPr>
             <w:rStyle w:val="Hyperlink"/>
@@ -5375,8 +5795,8 @@
         <w:t xml:space="preserve">.</w:t>
       </w:r>
     </w:p>
-    <w:bookmarkEnd w:id="58"/>
-    <w:bookmarkStart w:id="60" w:name="ref-pullum2001"/>
+    <w:bookmarkEnd w:id="67"/>
+    <w:bookmarkStart w:id="69" w:name="ref-pullum2001"/>
     <w:p>
       <w:pPr>
         <w:pStyle w:val="Bibliography"/>
@@ -5476,7 +5896,7 @@
         </w:rPr>
         <w:t xml:space="preserve">, edited by Philippe de Groote, Glyn Morrill, and Christian Retoré, 2099:17–43. Lecture Notes in Computer Science. Berlin, Heidelberg: Springer. doi:</w:t>
       </w:r>
-      <w:hyperlink r:id="rId59">
+      <w:hyperlink r:id="rId68">
         <w:r>
           <w:rPr>
             <w:rStyle w:val="Hyperlink"/>
@@ -5492,8 +5912,8 @@
         <w:t xml:space="preserve">.</w:t>
       </w:r>
     </w:p>
-    <w:bookmarkEnd w:id="60"/>
-    <w:bookmarkStart w:id="62" w:name="ref-raz2022NormativePowers"/>
+    <w:bookmarkEnd w:id="69"/>
+    <w:bookmarkStart w:id="71" w:name="ref-raz2022NormativePowers"/>
     <w:p>
       <w:pPr>
         <w:pStyle w:val="Bibliography"/>
@@ -5557,7 +5977,7 @@
         </w:rPr>
         <w:t xml:space="preserve">, edited by Ulrike Heuer, 162–78. Oxford: Oxford University Press. doi:</w:t>
       </w:r>
-      <w:hyperlink r:id="rId61">
+      <w:hyperlink r:id="rId70">
         <w:r>
           <w:rPr>
             <w:rStyle w:val="Hyperlink"/>
@@ -5573,8 +5993,8 @@
         <w:t xml:space="preserve">.</w:t>
       </w:r>
     </w:p>
-    <w:bookmarkEnd w:id="62"/>
-    <w:bookmarkStart w:id="64" w:name="ref-sbisa2023OnIllocutionaryTypes"/>
+    <w:bookmarkEnd w:id="71"/>
+    <w:bookmarkStart w:id="73" w:name="ref-sbisa2023OnIllocutionaryTypes"/>
     <w:p>
       <w:pPr>
         <w:pStyle w:val="Bibliography"/>
@@ -5638,7 +6058,7 @@
         </w:rPr>
         <w:t xml:space="preserve">, edited by Marina Sbisà, 23–42. Oxford: Oxford University Press. doi:</w:t>
       </w:r>
-      <w:hyperlink r:id="rId63">
+      <w:hyperlink r:id="rId72">
         <w:r>
           <w:rPr>
             <w:rStyle w:val="Hyperlink"/>
@@ -5654,8 +6074,8 @@
         <w:t xml:space="preserve">.</w:t>
       </w:r>
     </w:p>
-    <w:bookmarkEnd w:id="64"/>
-    <w:bookmarkStart w:id="65" w:name="ref-searle1995Construction"/>
+    <w:bookmarkEnd w:id="73"/>
+    <w:bookmarkStart w:id="74" w:name="ref-searle1995Construction"/>
     <w:p>
       <w:pPr>
         <w:pStyle w:val="Bibliography"/>
@@ -5692,8 +6112,8 @@
         <w:t xml:space="preserve">. New York: Free Press.</w:t>
       </w:r>
     </w:p>
-    <w:bookmarkEnd w:id="65"/>
-    <w:bookmarkStart w:id="67" w:name="ref-weinbergerSignalManipulation"/>
+    <w:bookmarkEnd w:id="74"/>
+    <w:bookmarkStart w:id="76" w:name="ref-weinbergerSignalManipulation"/>
     <w:p>
       <w:pPr>
         <w:pStyle w:val="Bibliography"/>
@@ -5750,7 +6170,7 @@
         </w:rPr>
         <w:t xml:space="preserve">9 (46): 1264–87. doi:</w:t>
       </w:r>
-      <w:hyperlink r:id="rId66">
+      <w:hyperlink r:id="rId75">
         <w:r>
           <w:rPr>
             <w:rStyle w:val="Hyperlink"/>
@@ -5766,8 +6186,8 @@
         <w:t xml:space="preserve">.</w:t>
       </w:r>
     </w:p>
-    <w:bookmarkEnd w:id="67"/>
-    <w:bookmarkStart w:id="69" w:name="ref-woodward2003MakingThingsHappen"/>
+    <w:bookmarkEnd w:id="76"/>
+    <w:bookmarkStart w:id="78" w:name="ref-woodward2003MakingThingsHappen"/>
     <w:p>
       <w:pPr>
         <w:pStyle w:val="Bibliography"/>
@@ -5803,7 +6223,7 @@
         </w:rPr>
         <w:t xml:space="preserve">. New York: Oxford University Press. doi:</w:t>
       </w:r>
-      <w:hyperlink r:id="rId68">
+      <w:hyperlink r:id="rId77">
         <w:r>
           <w:rPr>
             <w:rStyle w:val="Hyperlink"/>
@@ -5819,8 +6239,8 @@
         <w:t xml:space="preserve">.</w:t>
       </w:r>
     </w:p>
-    <w:bookmarkEnd w:id="69"/>
-    <w:bookmarkStart w:id="71" w:name="ref-woodward2014MethodologyOntology"/>
+    <w:bookmarkEnd w:id="78"/>
+    <w:bookmarkStart w:id="80" w:name="ref-woodward2014MethodologyOntology"/>
     <w:p>
       <w:pPr>
         <w:pStyle w:val="Bibliography"/>
@@ -5877,7 +6297,7 @@
         </w:rPr>
         <w:t xml:space="preserve">192 (11): 3577–99. doi:</w:t>
       </w:r>
-      <w:hyperlink r:id="rId70">
+      <w:hyperlink r:id="rId79">
         <w:r>
           <w:rPr>
             <w:rStyle w:val="Hyperlink"/>
@@ -5893,10 +6313,11 @@
         <w:t xml:space="preserve">.</w:t>
       </w:r>
     </w:p>
-    <w:bookmarkEnd w:id="71"/>
-    <w:bookmarkEnd w:id="72"/>
-    <w:bookmarkEnd w:id="73"/>
+    <w:bookmarkEnd w:id="80"/>
+    <w:bookmarkEnd w:id="81"/>
+    <w:bookmarkEnd w:id="82"/>
     <w:sectPr>
+      <w:footerReference w:type="default" r:id="rId9"/>
       <w:footnotePr>
         <w:numRestart w:val="eachSect"/>
       </w:footnotePr>
@@ -5907,6 +6328,28 @@
 </w:document>
 </file>
 
+<file path=word/footer1.xml><?xml version="1.0" encoding="utf-8"?>
+<w:ftr xmlns:m="http://schemas.openxmlformats.org/officeDocument/2006/math" xmlns:mc="http://schemas.openxmlformats.org/markup-compatibility/2006" xmlns:mo="http://schemas.microsoft.com/office/mac/office/2008/main" xmlns:mv="urn:schemas-microsoft-com:mac:vml" xmlns:o="urn:schemas-microsoft-com:office:office" xmlns:r="http://schemas.openxmlformats.org/officeDocument/2006/relationships" xmlns:v="urn:schemas-microsoft-com:vml" xmlns:w10="urn:schemas-microsoft-com:office:word" xmlns:w14="http://schemas.microsoft.com/office/word/2010/wordml" xmlns:w="http://schemas.openxmlformats.org/wordprocessingml/2006/main" xmlns:wne="http://schemas.microsoft.com/office/word/2006/wordml" xmlns:wp14="http://schemas.microsoft.com/office/word/2010/wordprocessingDrawing" xmlns:wp="http://schemas.openxmlformats.org/drawingml/2006/wordprocessingDrawing" xmlns:wpc="http://schemas.microsoft.com/office/word/2010/wordprocessingCanvas" xmlns:wpg="http://schemas.microsoft.com/office/word/2010/wordprocessingGroup" xmlns:wpi="http://schemas.microsoft.com/office/word/2010/wordprocessingInk" xmlns:wps="http://schemas.microsoft.com/office/word/2010/wordprocessingShape" mc:Ignorable="w14 wp14">
+  <w:p>
+    <w:pPr>
+      <w:pStyle w:val="Footer"/>
+      <w:jc w:val="center"/>
+    </w:pPr>
+    <w:r>
+      <w:rPr>
+        <w:rFonts w:ascii="Times New Roman" w:hAnsi="Times New Roman" w:cs="Times New Roman"/>
+        <w:sz w:val="24"/>
+      </w:rPr>
+      <w:fldChar w:fldCharType="begin"/>
+      <w:instrText xml:space="preserve"> PAGE </w:instrText>
+      <w:fldChar w:fldCharType="separate"/>
+      <w:t>1</w:t>
+      <w:fldChar w:fldCharType="end"/>
+    </w:r>
+  </w:p>
+</w:ftr>
+</file>
+
 <file path=word/footnotes.xml><?xml version="1.0" encoding="utf-8"?>
 <w:footnotes xmlns:w="http://schemas.openxmlformats.org/wordprocessingml/2006/main" xmlns:m="http://schemas.openxmlformats.org/officeDocument/2006/math" xmlns:r="http://schemas.openxmlformats.org/officeDocument/2006/relationships" xmlns:o="urn:schemas-microsoft-com:office:office" xmlns:v="urn:schemas-microsoft-com:vml" xmlns:w10="urn:schemas-microsoft-com:office:word" xmlns:a="http://schemas.openxmlformats.org/drawingml/2006/main" xmlns:pic="http://schemas.openxmlformats.org/drawingml/2006/picture" xmlns:wp="http://schemas.openxmlformats.org/drawingml/2006/wordprocessingDrawing">
   <w:footnote w:type="continuationSeparator" w:id="0">
@@ -5923,7 +6366,7 @@
       </w:r>
     </w:p>
   </w:footnote>
-  <w:footnote w:id="10">
+  <w:footnote w:id="11">
     <w:p>
       <w:pPr>
         <w:pStyle w:val="FootnoteText"/>
@@ -5964,7 +6407,7 @@
       </w:r>
     </w:p>
   </w:footnote>
-  <w:footnote w:id="14">
+  <w:footnote w:id="15">
     <w:p>
       <w:pPr>
         <w:pStyle w:val="FootnoteText"/>

</xml_diff>